<commit_message>
feat: add stage admission and refine course materials
</commit_message>
<xml_diff>
--- a/docs/documentation.docx
+++ b/docs/documentation.docx
@@ -88,7 +88,7 @@
         <w:jc w:val="center"/>
       </w:pPr>
       <w:r>
-        <w:t>18. října 2026</w:t>
+        <w:t>19. října 2026</w:t>
       </w:r>
     </w:p>
     <w:p>
@@ -518,7 +518,7 @@
               <w:rPr>
                 <w:sz w:val="16"/>
               </w:rPr>
-              <w:t>Výběr 1/2/3 dnů, sedadla nebo stání, kemp, promo, PDF</w:t>
+              <w:t>Všechny scény / jedna scéna, 1/2/3 dny, sedadla nebo stání, kemp, promo, PDF</w:t>
             </w:r>
           </w:p>
         </w:tc>
@@ -1927,7 +1927,7 @@
               <w:rPr>
                 <w:sz w:val="16"/>
               </w:rPr>
-              <w:t>Klíč scény, název, lokace, kapacita a popis</w:t>
+              <w:t>Klíč scény, název, lokace, kapacita, popis a ceník scény</w:t>
             </w:r>
           </w:p>
         </w:tc>
@@ -1945,7 +1945,7 @@
               <w:rPr>
                 <w:sz w:val="16"/>
               </w:rPr>
-              <w:t>Scény a program</w:t>
+              <w:t>Scény, program a dostupnost vstupů</w:t>
             </w:r>
           </w:p>
         </w:tc>
@@ -2295,7 +2295,7 @@
               <w:rPr>
                 <w:sz w:val="16"/>
               </w:rPr>
-              <w:t>Šest záznamů: 3 kategorie × denní/celofestivalový tarif</w:t>
+              <w:t>Šest záznamů: 3 kategorie × denní/celofestivalový tarif pro všechny scény</w:t>
             </w:r>
           </w:p>
         </w:tc>
@@ -2312,7 +2312,7 @@
               <w:rPr>
                 <w:sz w:val="16"/>
               </w:rPr>
-              <w:t>Ceník a výpočet varianty na dva dny</w:t>
+              <w:t>Ceník společného vstupu a varianty na dva dny</w:t>
             </w:r>
           </w:p>
         </w:tc>
@@ -2341,20 +2341,7 @@
                 <w:rFonts w:ascii="Consolas" w:hAnsi="Consolas"/>
                 <w:sz w:val="16"/>
               </w:rPr>
-              <w:t>kempovani</w:t>
-            </w:r>
-            <w:r>
-              <w:rPr>
-                <w:sz w:val="16"/>
-              </w:rPr>
-              <w:t xml:space="preserve">, </w:t>
-            </w:r>
-            <w:r>
-              <w:rPr>
-                <w:rFonts w:ascii="Consolas" w:hAnsi="Consolas"/>
-                <w:sz w:val="16"/>
-              </w:rPr>
-              <w:t>sazba_dph</w:t>
+              <w:t>hala/vstupenky_sceny</w:t>
             </w:r>
             <w:r>
               <w:rPr>
@@ -2377,7 +2364,7 @@
               <w:rPr>
                 <w:sz w:val="16"/>
               </w:rPr>
-              <w:t>Typy míst, ceny, kapacity, pobyt a modelová daň</w:t>
+              <w:t>Kapacita stání, řady sedadel a ceny jednotlivé scény</w:t>
             </w:r>
           </w:p>
         </w:tc>
@@ -2395,7 +2382,7 @@
               <w:rPr>
                 <w:sz w:val="16"/>
               </w:rPr>
-              <w:t>Košík, poukaz a daňový rozpis</w:t>
+              <w:t>Samostatný vstup a společná fyzická kapacita</w:t>
             </w:r>
           </w:p>
         </w:tc>
@@ -2423,6 +2410,181 @@
                 <w:rFonts w:ascii="Consolas" w:hAnsi="Consolas"/>
                 <w:sz w:val="16"/>
               </w:rPr>
+              <w:t>akce/hlavni_vystoupeni</w:t>
+            </w:r>
+            <w:r>
+              <w:rPr>
+                <w:sz w:val="16"/>
+              </w:rPr>
+            </w:r>
+          </w:p>
+        </w:tc>
+        <w:tc>
+          <w:tcPr>
+            <w:tcW w:type="dxa" w:w="3175"/>
+            <w:vAlign w:val="center"/>
+          </w:tcPr>
+          <w:p>
+            <w:pPr>
+              <w:spacing w:after="80" w:before="80" w:line="264" w:lineRule="auto"/>
+            </w:pPr>
+            <w:r>
+              <w:rPr>
+                <w:sz w:val="16"/>
+              </w:rPr>
+              <w:t xml:space="preserve">Závěrečný koncert; v JSON a </w:t>
+            </w:r>
+            <w:r>
+              <w:rPr>
+                <w:rFonts w:ascii="Consolas" w:hAnsi="Consolas"/>
+                <w:sz w:val="16"/>
+              </w:rPr>
+              <w:t>data.js</w:t>
+            </w:r>
+            <w:r>
+              <w:rPr>
+                <w:sz w:val="16"/>
+              </w:rPr>
+              <w:t xml:space="preserve"> jako </w:t>
+            </w:r>
+            <w:r>
+              <w:rPr>
+                <w:rFonts w:ascii="Consolas" w:hAnsi="Consolas"/>
+                <w:sz w:val="16"/>
+              </w:rPr>
+              <w:t>highlight</w:t>
+            </w:r>
+            <w:r>
+              <w:rPr>
+                <w:sz w:val="16"/>
+              </w:rPr>
+            </w:r>
+          </w:p>
+        </w:tc>
+        <w:tc>
+          <w:tcPr>
+            <w:tcW w:type="dxa" w:w="3175"/>
+            <w:vAlign w:val="center"/>
+          </w:tcPr>
+          <w:p>
+            <w:pPr>
+              <w:spacing w:after="80" w:before="80" w:line="264" w:lineRule="auto"/>
+            </w:pPr>
+            <w:r>
+              <w:rPr>
+                <w:sz w:val="16"/>
+              </w:rPr>
+              <w:t>Devět navazujících večerních koncertů</w:t>
+            </w:r>
+          </w:p>
+        </w:tc>
+      </w:tr>
+      <w:tr>
+        <w:trPr>
+          <w:cantSplit/>
+        </w:trPr>
+        <w:tc>
+          <w:tcPr>
+            <w:tcW w:type="dxa" w:w="3175"/>
+            <w:vAlign w:val="center"/>
+            <w:shd w:fill="F5F5F5"/>
+          </w:tcPr>
+          <w:p>
+            <w:pPr>
+              <w:spacing w:after="80" w:before="80" w:line="264" w:lineRule="auto"/>
+            </w:pPr>
+            <w:r>
+              <w:rPr>
+                <w:sz w:val="16"/>
+              </w:rPr>
+            </w:r>
+            <w:r>
+              <w:rPr>
+                <w:rFonts w:ascii="Consolas" w:hAnsi="Consolas"/>
+                <w:sz w:val="16"/>
+              </w:rPr>
+              <w:t>kempovani</w:t>
+            </w:r>
+            <w:r>
+              <w:rPr>
+                <w:sz w:val="16"/>
+              </w:rPr>
+              <w:t xml:space="preserve">, </w:t>
+            </w:r>
+            <w:r>
+              <w:rPr>
+                <w:rFonts w:ascii="Consolas" w:hAnsi="Consolas"/>
+                <w:sz w:val="16"/>
+              </w:rPr>
+              <w:t>sazba_dph</w:t>
+            </w:r>
+            <w:r>
+              <w:rPr>
+                <w:sz w:val="16"/>
+              </w:rPr>
+            </w:r>
+          </w:p>
+        </w:tc>
+        <w:tc>
+          <w:tcPr>
+            <w:tcW w:type="dxa" w:w="3175"/>
+            <w:vAlign w:val="center"/>
+            <w:shd w:fill="F5F5F5"/>
+          </w:tcPr>
+          <w:p>
+            <w:pPr>
+              <w:spacing w:after="80" w:before="80" w:line="264" w:lineRule="auto"/>
+            </w:pPr>
+            <w:r>
+              <w:rPr>
+                <w:sz w:val="16"/>
+              </w:rPr>
+              <w:t>Typy míst, ceny, kapacity, pobyt a modelová daň</w:t>
+            </w:r>
+          </w:p>
+        </w:tc>
+        <w:tc>
+          <w:tcPr>
+            <w:tcW w:type="dxa" w:w="3175"/>
+            <w:vAlign w:val="center"/>
+            <w:shd w:fill="F5F5F5"/>
+          </w:tcPr>
+          <w:p>
+            <w:pPr>
+              <w:spacing w:after="80" w:before="80" w:line="264" w:lineRule="auto"/>
+            </w:pPr>
+            <w:r>
+              <w:rPr>
+                <w:sz w:val="16"/>
+              </w:rPr>
+              <w:t>Košík, poukaz a daňový rozpis</w:t>
+            </w:r>
+          </w:p>
+        </w:tc>
+      </w:tr>
+      <w:tr>
+        <w:trPr>
+          <w:cantSplit/>
+        </w:trPr>
+        <w:tc>
+          <w:tcPr>
+            <w:tcW w:type="dxa" w:w="3175"/>
+            <w:vAlign w:val="center"/>
+          </w:tcPr>
+          <w:p>
+            <w:pPr>
+              <w:spacing w:after="80" w:before="80" w:line="264" w:lineRule="auto"/>
+            </w:pPr>
+            <w:r>
+              <w:rPr>
+                <w:sz w:val="16"/>
+              </w:rPr>
+            </w:r>
+            <w:r>
+              <w:rPr>
+                <w:rFonts w:ascii="Consolas" w:hAnsi="Consolas"/>
+                <w:sz w:val="16"/>
+              </w:rPr>
               <w:t>kontakt</w:t>
             </w:r>
             <w:r>
@@ -2489,16 +2651,32 @@
     <w:p>
       <w:pPr/>
       <w:r>
-        <w:t xml:space="preserve">Program je řazen podle dne a začátku. Dvě vystoupení na stejné scéně se nepřekrývají; </w:t>
+        <w:t xml:space="preserve">Program je řazen podle dne a začátku. Dvě vystoupení na stejné scéně se nepřekrývají; přestavba trvá nejméně 30 minut. </w:t>
       </w:r>
       <w:r>
         <w:rPr>
           <w:b/>
         </w:rPr>
-        <w:t>různé scény mohou hrát souběžně</w:t>
+        <w:t>Různé scény mohou hrát souběžně.</w:t>
       </w:r>
       <w:r>
-        <w:t>. Každá má 20 vystoupení.</w:t>
+        <w:t xml:space="preserve"> Každá má 20 vystoupení, celkem je 20 setů za den. Běžný set má 60 minut a hlavní koncert v Main Hall 90 minut.</w:t>
+      </w:r>
+    </w:p>
+    <w:p>
+      <w:pPr/>
+      <w:r>
+        <w:t xml:space="preserve">Tři závěrečné koncerty každý den navazují: River 18:30–19:30, Club 20:00–21:00 a Main Hall 21:30–23:00. Mezi nimi zbývá 30 minut na přesun. Těchto devět položek označuje příznak </w:t>
+      </w:r>
+      <w:r>
+        <w:rPr>
+          <w:rFonts w:ascii="Consolas" w:hAnsi="Consolas"/>
+          <w:sz w:val="18"/>
+        </w:rPr>
+        <w:t>highlight</w:t>
+      </w:r>
+      <w:r>
+        <w:t>. Společná třídenní vstupenka umožňuje vidět všechny tyto koncerty; netvrdíme, že lze stihnout všech 60 celých setů. Osobní program upozorní na časové překryvy uložených vystoupení.</w:t>
       </w:r>
     </w:p>
     <w:p>
@@ -2775,27 +2953,7 @@
     <w:p>
       <w:pPr/>
       <w:r>
-        <w:t>Vstupenka nyní platí pro všechny scény v jednom, dvou libovolných nebo třech dnech. VIP a Regular mají ruční volbu místa, stání počet osob. Model zahrnuje 48 sedadel a 40 míst ke stání na den. Nejde o skutečnou kapacitu jednotlivých scén ani jejich samostatný rezervační systém; tuto změnu zadavatel odložil.</w:t>
-      </w:r>
-    </w:p>
-    <w:p>
-      <w:pPr/>
-      <w:r>
-        <w:t>Košík místo ještě nerezervuje. Při dokončení se znovu kontroluje cena, překryv dnů, obsazenost a kapacita kempu. Nákup 1. a 3. dne sám neobsadí</w:t>
-      </w:r>
-    </w:p>
-    <w:p>
-      <w:pPr>
-        <w:pStyle w:val="ListNumber"/>
-      </w:pPr>
-      <w:r>
-        <w:t>den. Místní data nejsou sdílená mezi zařízeními. Objednávky staršího</w:t>
-      </w:r>
-    </w:p>
-    <w:p>
-      <w:pPr/>
-      <w:r>
-        <w:t>ročníku zůstávají v historii, ale neblokují aktuální ročník.</w:t>
+        <w:t>Vstupenka rozlišuje všechny scény nebo jednu konkrétní scénu a jeden, dva libovolné či tři dny. Main Hall nabízí VIP a Regular sedadla i stání; River a Club pouze stání. U společného VIP/Regular vstupu je sedadlo v Main Hall, na ostatních scénách se stojí.</w:t>
       </w:r>
     </w:p>
     <w:tbl>
@@ -2806,10 +2964,9 @@
         <w:tblLook w:firstColumn="1" w:firstRow="1" w:lastColumn="0" w:lastRow="0" w:noHBand="0" w:noVBand="1" w:val="04A0"/>
       </w:tblPr>
       <w:tblGrid>
-        <w:gridCol w:w="2381"/>
-        <w:gridCol w:w="2381"/>
-        <w:gridCol w:w="2381"/>
-        <w:gridCol w:w="2381"/>
+        <w:gridCol w:w="3175"/>
+        <w:gridCol w:w="3175"/>
+        <w:gridCol w:w="3175"/>
       </w:tblGrid>
       <w:tr>
         <w:trPr>
@@ -2818,7 +2975,7 @@
         </w:trPr>
         <w:tc>
           <w:tcPr>
-            <w:tcW w:type="dxa" w:w="2381"/>
+            <w:tcW w:type="dxa" w:w="3175"/>
             <w:vAlign w:val="center"/>
             <w:shd w:fill="F3DFD7"/>
           </w:tcPr>
@@ -2831,13 +2988,13 @@
                 <w:b/>
                 <w:sz w:val="16"/>
               </w:rPr>
-              <w:t>Kategorie</w:t>
+              <w:t>Scéna</w:t>
             </w:r>
           </w:p>
         </w:tc>
         <w:tc>
           <w:tcPr>
-            <w:tcW w:type="dxa" w:w="2381"/>
+            <w:tcW w:type="dxa" w:w="3175"/>
             <w:vAlign w:val="center"/>
             <w:shd w:fill="F3DFD7"/>
           </w:tcPr>
@@ -2850,13 +3007,13 @@
                 <w:b/>
                 <w:sz w:val="16"/>
               </w:rPr>
-              <w:t>1 den</w:t>
+              <w:t>Kapacita na den</w:t>
             </w:r>
           </w:p>
         </w:tc>
         <w:tc>
           <w:tcPr>
-            <w:tcW w:type="dxa" w:w="2381"/>
+            <w:tcW w:type="dxa" w:w="3175"/>
             <w:vAlign w:val="center"/>
             <w:shd w:fill="F3DFD7"/>
           </w:tcPr>
@@ -2869,26 +3026,7 @@
                 <w:b/>
                 <w:sz w:val="16"/>
               </w:rPr>
-              <w:t>2 libovolné dny</w:t>
-            </w:r>
-          </w:p>
-        </w:tc>
-        <w:tc>
-          <w:tcPr>
-            <w:tcW w:type="dxa" w:w="2381"/>
-            <w:vAlign w:val="center"/>
-            <w:shd w:fill="F3DFD7"/>
-          </w:tcPr>
-          <w:p>
-            <w:pPr>
-              <w:spacing w:after="80" w:before="80" w:line="264" w:lineRule="auto"/>
-            </w:pPr>
-            <w:r>
-              <w:rPr>
-                <w:b/>
-                <w:sz w:val="16"/>
-              </w:rPr>
-              <w:t>3 dny</w:t>
+              <w:t>Zóny</w:t>
             </w:r>
           </w:p>
         </w:tc>
@@ -2899,7 +3037,7 @@
         </w:trPr>
         <w:tc>
           <w:tcPr>
-            <w:tcW w:type="dxa" w:w="2381"/>
+            <w:tcW w:type="dxa" w:w="3175"/>
             <w:vAlign w:val="center"/>
           </w:tcPr>
           <w:p>
@@ -2910,13 +3048,13 @@
               <w:rPr>
                 <w:sz w:val="16"/>
               </w:rPr>
-              <w:t>VIP</w:t>
+              <w:t>Main Hall</w:t>
             </w:r>
           </w:p>
         </w:tc>
         <w:tc>
           <w:tcPr>
-            <w:tcW w:type="dxa" w:w="2381"/>
+            <w:tcW w:type="dxa" w:w="3175"/>
             <w:vAlign w:val="center"/>
           </w:tcPr>
           <w:p>
@@ -2927,13 +3065,13 @@
               <w:rPr>
                 <w:sz w:val="16"/>
               </w:rPr>
-              <w:t>590 Kč</w:t>
+              <w:t>5 000</w:t>
             </w:r>
           </w:p>
         </w:tc>
         <w:tc>
           <w:tcPr>
-            <w:tcW w:type="dxa" w:w="2381"/>
+            <w:tcW w:type="dxa" w:w="3175"/>
             <w:vAlign w:val="center"/>
           </w:tcPr>
           <w:p>
@@ -2944,24 +3082,7 @@
               <w:rPr>
                 <w:sz w:val="16"/>
               </w:rPr>
-              <w:t>1 180 Kč</w:t>
-            </w:r>
-          </w:p>
-        </w:tc>
-        <w:tc>
-          <w:tcPr>
-            <w:tcW w:type="dxa" w:w="2381"/>
-            <w:vAlign w:val="center"/>
-          </w:tcPr>
-          <w:p>
-            <w:pPr>
-              <w:spacing w:after="80" w:before="80" w:line="264" w:lineRule="auto"/>
-            </w:pPr>
-            <w:r>
-              <w:rPr>
-                <w:sz w:val="16"/>
-              </w:rPr>
-              <w:t>1 590 Kč</w:t>
+              <w:t>16 VIP, 32 Regular, 4 952 stání</w:t>
             </w:r>
           </w:p>
         </w:tc>
@@ -2972,7 +3093,7 @@
         </w:trPr>
         <w:tc>
           <w:tcPr>
-            <w:tcW w:type="dxa" w:w="2381"/>
+            <w:tcW w:type="dxa" w:w="3175"/>
             <w:vAlign w:val="center"/>
             <w:shd w:fill="F5F5F5"/>
           </w:tcPr>
@@ -2984,13 +3105,13 @@
               <w:rPr>
                 <w:sz w:val="16"/>
               </w:rPr>
-              <w:t>Regular</w:t>
+              <w:t>River Stage</w:t>
             </w:r>
           </w:p>
         </w:tc>
         <w:tc>
           <w:tcPr>
-            <w:tcW w:type="dxa" w:w="2381"/>
+            <w:tcW w:type="dxa" w:w="3175"/>
             <w:vAlign w:val="center"/>
             <w:shd w:fill="F5F5F5"/>
           </w:tcPr>
@@ -3002,13 +3123,13 @@
               <w:rPr>
                 <w:sz w:val="16"/>
               </w:rPr>
-              <w:t>390 Kč</w:t>
+              <w:t>3 000</w:t>
             </w:r>
           </w:p>
         </w:tc>
         <w:tc>
           <w:tcPr>
-            <w:tcW w:type="dxa" w:w="2381"/>
+            <w:tcW w:type="dxa" w:w="3175"/>
             <w:vAlign w:val="center"/>
             <w:shd w:fill="F5F5F5"/>
           </w:tcPr>
@@ -3020,25 +3141,7 @@
               <w:rPr>
                 <w:sz w:val="16"/>
               </w:rPr>
-              <w:t>780 Kč</w:t>
-            </w:r>
-          </w:p>
-        </w:tc>
-        <w:tc>
-          <w:tcPr>
-            <w:tcW w:type="dxa" w:w="2381"/>
-            <w:vAlign w:val="center"/>
-            <w:shd w:fill="F5F5F5"/>
-          </w:tcPr>
-          <w:p>
-            <w:pPr>
-              <w:spacing w:after="80" w:before="80" w:line="264" w:lineRule="auto"/>
-            </w:pPr>
-            <w:r>
-              <w:rPr>
-                <w:sz w:val="16"/>
-              </w:rPr>
-              <w:t>990 Kč</w:t>
+              <w:t>Stání</w:t>
             </w:r>
           </w:p>
         </w:tc>
@@ -3049,7 +3152,7 @@
         </w:trPr>
         <w:tc>
           <w:tcPr>
-            <w:tcW w:type="dxa" w:w="2381"/>
+            <w:tcW w:type="dxa" w:w="3175"/>
             <w:vAlign w:val="center"/>
           </w:tcPr>
           <w:p>
@@ -3060,13 +3163,13 @@
               <w:rPr>
                 <w:sz w:val="16"/>
               </w:rPr>
-              <w:t>Stání</w:t>
+              <w:t>Club Stage</w:t>
             </w:r>
           </w:p>
         </w:tc>
         <w:tc>
           <w:tcPr>
-            <w:tcW w:type="dxa" w:w="2381"/>
+            <w:tcW w:type="dxa" w:w="3175"/>
             <w:vAlign w:val="center"/>
           </w:tcPr>
           <w:p>
@@ -3077,13 +3180,13 @@
               <w:rPr>
                 <w:sz w:val="16"/>
               </w:rPr>
-              <w:t>190 Kč</w:t>
+              <w:t>1 500</w:t>
             </w:r>
           </w:p>
         </w:tc>
         <w:tc>
           <w:tcPr>
-            <w:tcW w:type="dxa" w:w="2381"/>
+            <w:tcW w:type="dxa" w:w="3175"/>
             <w:vAlign w:val="center"/>
           </w:tcPr>
           <w:p>
@@ -3094,24 +3197,7 @@
               <w:rPr>
                 <w:sz w:val="16"/>
               </w:rPr>
-              <w:t>380 Kč</w:t>
-            </w:r>
-          </w:p>
-        </w:tc>
-        <w:tc>
-          <w:tcPr>
-            <w:tcW w:type="dxa" w:w="2381"/>
-            <w:vAlign w:val="center"/>
-          </w:tcPr>
-          <w:p>
-            <w:pPr>
-              <w:spacing w:after="80" w:before="80" w:line="264" w:lineRule="auto"/>
-            </w:pPr>
-            <w:r>
-              <w:rPr>
-                <w:sz w:val="16"/>
-              </w:rPr>
-              <w:t>490 Kč</w:t>
+              <w:t>Stání</w:t>
             </w:r>
           </w:p>
         </w:tc>
@@ -3121,6 +3207,919 @@
       <w:pPr>
         <w:spacing w:after="0"/>
       </w:pPr>
+    </w:p>
+    <w:p>
+      <w:pPr/>
+      <w:r>
+        <w:t>Kapacity jsou návrhové pro fiktivní festival. Nejde o oficiální povolené kapacity Výstaviště. Společná vstupenka započítá jednu osobu na každé scéně v každém zvoleném dni, proto její dostupnost omezuje i nejmenší Club Stage. Samostatný vstup zabírá jen příslušnou scénu. Stejné fyzické sedadlo v Main Hall nelze prodat zároveň v samostatné a společné variantě. Stání má konečnou kapacitu, ale nevyžaduje kreslení tisíců tlačítek sedadel. Jeho interní číslo není rezervovaná pozice: při vícedenním vstupu rozhoduje volná kapacita každého dne, nikoli shodné číslo stání v různých dnech.</w:t>
+      </w:r>
+    </w:p>
+    <w:p>
+      <w:pPr/>
+      <w:r>
+        <w:t>Výběr dovoluje nejvýše osm osob najednou, celá objednávka nejvýše 264 vstupenek. Vyšší počet se odmítne před přidáním i při dokončení objednávky, aby každou přijatou objednávku bylo možné stáhnout jako PDF.</w:t>
+      </w:r>
+    </w:p>
+    <w:tbl>
+      <w:tblPr>
+        <w:tblW w:type="auto" w:w="0"/>
+        <w:jc w:val="center"/>
+        <w:tblLayout w:type="fixed"/>
+        <w:tblLook w:firstColumn="1" w:firstRow="1" w:lastColumn="0" w:lastRow="0" w:noHBand="0" w:noVBand="1" w:val="04A0"/>
+      </w:tblPr>
+      <w:tblGrid>
+        <w:gridCol w:w="1905"/>
+        <w:gridCol w:w="1905"/>
+        <w:gridCol w:w="1905"/>
+        <w:gridCol w:w="1905"/>
+        <w:gridCol w:w="1905"/>
+      </w:tblGrid>
+      <w:tr>
+        <w:trPr>
+          <w:cantSplit/>
+          <w:tblHeader/>
+        </w:trPr>
+        <w:tc>
+          <w:tcPr>
+            <w:tcW w:type="dxa" w:w="1905"/>
+            <w:vAlign w:val="center"/>
+            <w:shd w:fill="F3DFD7"/>
+          </w:tcPr>
+          <w:p>
+            <w:pPr>
+              <w:spacing w:after="80" w:before="80" w:line="264" w:lineRule="auto"/>
+            </w:pPr>
+            <w:r>
+              <w:rPr>
+                <w:b/>
+                <w:sz w:val="16"/>
+              </w:rPr>
+              <w:t>Rozsah</w:t>
+            </w:r>
+          </w:p>
+        </w:tc>
+        <w:tc>
+          <w:tcPr>
+            <w:tcW w:type="dxa" w:w="1905"/>
+            <w:vAlign w:val="center"/>
+            <w:shd w:fill="F3DFD7"/>
+          </w:tcPr>
+          <w:p>
+            <w:pPr>
+              <w:spacing w:after="80" w:before="80" w:line="264" w:lineRule="auto"/>
+            </w:pPr>
+            <w:r>
+              <w:rPr>
+                <w:b/>
+                <w:sz w:val="16"/>
+              </w:rPr>
+              <w:t>Kategorie</w:t>
+            </w:r>
+          </w:p>
+        </w:tc>
+        <w:tc>
+          <w:tcPr>
+            <w:tcW w:type="dxa" w:w="1905"/>
+            <w:vAlign w:val="center"/>
+            <w:shd w:fill="F3DFD7"/>
+          </w:tcPr>
+          <w:p>
+            <w:pPr>
+              <w:spacing w:after="80" w:before="80" w:line="264" w:lineRule="auto"/>
+            </w:pPr>
+            <w:r>
+              <w:rPr>
+                <w:b/>
+                <w:sz w:val="16"/>
+              </w:rPr>
+              <w:t>1 den</w:t>
+            </w:r>
+          </w:p>
+        </w:tc>
+        <w:tc>
+          <w:tcPr>
+            <w:tcW w:type="dxa" w:w="1905"/>
+            <w:vAlign w:val="center"/>
+            <w:shd w:fill="F3DFD7"/>
+          </w:tcPr>
+          <w:p>
+            <w:pPr>
+              <w:spacing w:after="80" w:before="80" w:line="264" w:lineRule="auto"/>
+            </w:pPr>
+            <w:r>
+              <w:rPr>
+                <w:b/>
+                <w:sz w:val="16"/>
+              </w:rPr>
+              <w:t>2 libovolné dny</w:t>
+            </w:r>
+          </w:p>
+        </w:tc>
+        <w:tc>
+          <w:tcPr>
+            <w:tcW w:type="dxa" w:w="1905"/>
+            <w:vAlign w:val="center"/>
+            <w:shd w:fill="F3DFD7"/>
+          </w:tcPr>
+          <w:p>
+            <w:pPr>
+              <w:spacing w:after="80" w:before="80" w:line="264" w:lineRule="auto"/>
+            </w:pPr>
+            <w:r>
+              <w:rPr>
+                <w:b/>
+                <w:sz w:val="16"/>
+              </w:rPr>
+              <w:t>3 dny</w:t>
+            </w:r>
+          </w:p>
+        </w:tc>
+      </w:tr>
+      <w:tr>
+        <w:trPr>
+          <w:cantSplit/>
+        </w:trPr>
+        <w:tc>
+          <w:tcPr>
+            <w:tcW w:type="dxa" w:w="1905"/>
+            <w:vAlign w:val="center"/>
+          </w:tcPr>
+          <w:p>
+            <w:pPr>
+              <w:spacing w:after="80" w:before="80" w:line="264" w:lineRule="auto"/>
+            </w:pPr>
+            <w:r>
+              <w:rPr>
+                <w:sz w:val="16"/>
+              </w:rPr>
+              <w:t>Všechny scény</w:t>
+            </w:r>
+          </w:p>
+        </w:tc>
+        <w:tc>
+          <w:tcPr>
+            <w:tcW w:type="dxa" w:w="1905"/>
+            <w:vAlign w:val="center"/>
+          </w:tcPr>
+          <w:p>
+            <w:pPr>
+              <w:spacing w:after="80" w:before="80" w:line="264" w:lineRule="auto"/>
+            </w:pPr>
+            <w:r>
+              <w:rPr>
+                <w:sz w:val="16"/>
+              </w:rPr>
+              <w:t>VIP</w:t>
+            </w:r>
+          </w:p>
+        </w:tc>
+        <w:tc>
+          <w:tcPr>
+            <w:tcW w:type="dxa" w:w="1905"/>
+            <w:vAlign w:val="center"/>
+          </w:tcPr>
+          <w:p>
+            <w:pPr>
+              <w:spacing w:after="80" w:before="80" w:line="264" w:lineRule="auto"/>
+            </w:pPr>
+            <w:r>
+              <w:rPr>
+                <w:sz w:val="16"/>
+              </w:rPr>
+              <w:t>590 Kč</w:t>
+            </w:r>
+          </w:p>
+        </w:tc>
+        <w:tc>
+          <w:tcPr>
+            <w:tcW w:type="dxa" w:w="1905"/>
+            <w:vAlign w:val="center"/>
+          </w:tcPr>
+          <w:p>
+            <w:pPr>
+              <w:spacing w:after="80" w:before="80" w:line="264" w:lineRule="auto"/>
+            </w:pPr>
+            <w:r>
+              <w:rPr>
+                <w:sz w:val="16"/>
+              </w:rPr>
+              <w:t>1 180 Kč</w:t>
+            </w:r>
+          </w:p>
+        </w:tc>
+        <w:tc>
+          <w:tcPr>
+            <w:tcW w:type="dxa" w:w="1905"/>
+            <w:vAlign w:val="center"/>
+          </w:tcPr>
+          <w:p>
+            <w:pPr>
+              <w:spacing w:after="80" w:before="80" w:line="264" w:lineRule="auto"/>
+            </w:pPr>
+            <w:r>
+              <w:rPr>
+                <w:sz w:val="16"/>
+              </w:rPr>
+              <w:t>1 590 Kč</w:t>
+            </w:r>
+          </w:p>
+        </w:tc>
+      </w:tr>
+      <w:tr>
+        <w:trPr>
+          <w:cantSplit/>
+        </w:trPr>
+        <w:tc>
+          <w:tcPr>
+            <w:tcW w:type="dxa" w:w="1905"/>
+            <w:vAlign w:val="center"/>
+            <w:shd w:fill="F5F5F5"/>
+          </w:tcPr>
+          <w:p>
+            <w:pPr>
+              <w:spacing w:after="80" w:before="80" w:line="264" w:lineRule="auto"/>
+            </w:pPr>
+            <w:r>
+              <w:rPr>
+                <w:sz w:val="16"/>
+              </w:rPr>
+              <w:t>Všechny scény</w:t>
+            </w:r>
+          </w:p>
+        </w:tc>
+        <w:tc>
+          <w:tcPr>
+            <w:tcW w:type="dxa" w:w="1905"/>
+            <w:vAlign w:val="center"/>
+            <w:shd w:fill="F5F5F5"/>
+          </w:tcPr>
+          <w:p>
+            <w:pPr>
+              <w:spacing w:after="80" w:before="80" w:line="264" w:lineRule="auto"/>
+            </w:pPr>
+            <w:r>
+              <w:rPr>
+                <w:sz w:val="16"/>
+              </w:rPr>
+              <w:t>Regular</w:t>
+            </w:r>
+          </w:p>
+        </w:tc>
+        <w:tc>
+          <w:tcPr>
+            <w:tcW w:type="dxa" w:w="1905"/>
+            <w:vAlign w:val="center"/>
+            <w:shd w:fill="F5F5F5"/>
+          </w:tcPr>
+          <w:p>
+            <w:pPr>
+              <w:spacing w:after="80" w:before="80" w:line="264" w:lineRule="auto"/>
+            </w:pPr>
+            <w:r>
+              <w:rPr>
+                <w:sz w:val="16"/>
+              </w:rPr>
+              <w:t>390 Kč</w:t>
+            </w:r>
+          </w:p>
+        </w:tc>
+        <w:tc>
+          <w:tcPr>
+            <w:tcW w:type="dxa" w:w="1905"/>
+            <w:vAlign w:val="center"/>
+            <w:shd w:fill="F5F5F5"/>
+          </w:tcPr>
+          <w:p>
+            <w:pPr>
+              <w:spacing w:after="80" w:before="80" w:line="264" w:lineRule="auto"/>
+            </w:pPr>
+            <w:r>
+              <w:rPr>
+                <w:sz w:val="16"/>
+              </w:rPr>
+              <w:t>780 Kč</w:t>
+            </w:r>
+          </w:p>
+        </w:tc>
+        <w:tc>
+          <w:tcPr>
+            <w:tcW w:type="dxa" w:w="1905"/>
+            <w:vAlign w:val="center"/>
+            <w:shd w:fill="F5F5F5"/>
+          </w:tcPr>
+          <w:p>
+            <w:pPr>
+              <w:spacing w:after="80" w:before="80" w:line="264" w:lineRule="auto"/>
+            </w:pPr>
+            <w:r>
+              <w:rPr>
+                <w:sz w:val="16"/>
+              </w:rPr>
+              <w:t>990 Kč</w:t>
+            </w:r>
+          </w:p>
+        </w:tc>
+      </w:tr>
+      <w:tr>
+        <w:trPr>
+          <w:cantSplit/>
+        </w:trPr>
+        <w:tc>
+          <w:tcPr>
+            <w:tcW w:type="dxa" w:w="1905"/>
+            <w:vAlign w:val="center"/>
+          </w:tcPr>
+          <w:p>
+            <w:pPr>
+              <w:spacing w:after="80" w:before="80" w:line="264" w:lineRule="auto"/>
+            </w:pPr>
+            <w:r>
+              <w:rPr>
+                <w:sz w:val="16"/>
+              </w:rPr>
+              <w:t>Všechny scény</w:t>
+            </w:r>
+          </w:p>
+        </w:tc>
+        <w:tc>
+          <w:tcPr>
+            <w:tcW w:type="dxa" w:w="1905"/>
+            <w:vAlign w:val="center"/>
+          </w:tcPr>
+          <w:p>
+            <w:pPr>
+              <w:spacing w:after="80" w:before="80" w:line="264" w:lineRule="auto"/>
+            </w:pPr>
+            <w:r>
+              <w:rPr>
+                <w:sz w:val="16"/>
+              </w:rPr>
+              <w:t>Stání</w:t>
+            </w:r>
+          </w:p>
+        </w:tc>
+        <w:tc>
+          <w:tcPr>
+            <w:tcW w:type="dxa" w:w="1905"/>
+            <w:vAlign w:val="center"/>
+          </w:tcPr>
+          <w:p>
+            <w:pPr>
+              <w:spacing w:after="80" w:before="80" w:line="264" w:lineRule="auto"/>
+            </w:pPr>
+            <w:r>
+              <w:rPr>
+                <w:sz w:val="16"/>
+              </w:rPr>
+              <w:t>190 Kč</w:t>
+            </w:r>
+          </w:p>
+        </w:tc>
+        <w:tc>
+          <w:tcPr>
+            <w:tcW w:type="dxa" w:w="1905"/>
+            <w:vAlign w:val="center"/>
+          </w:tcPr>
+          <w:p>
+            <w:pPr>
+              <w:spacing w:after="80" w:before="80" w:line="264" w:lineRule="auto"/>
+            </w:pPr>
+            <w:r>
+              <w:rPr>
+                <w:sz w:val="16"/>
+              </w:rPr>
+              <w:t>380 Kč</w:t>
+            </w:r>
+          </w:p>
+        </w:tc>
+        <w:tc>
+          <w:tcPr>
+            <w:tcW w:type="dxa" w:w="1905"/>
+            <w:vAlign w:val="center"/>
+          </w:tcPr>
+          <w:p>
+            <w:pPr>
+              <w:spacing w:after="80" w:before="80" w:line="264" w:lineRule="auto"/>
+            </w:pPr>
+            <w:r>
+              <w:rPr>
+                <w:sz w:val="16"/>
+              </w:rPr>
+              <w:t>490 Kč</w:t>
+            </w:r>
+          </w:p>
+        </w:tc>
+      </w:tr>
+      <w:tr>
+        <w:trPr>
+          <w:cantSplit/>
+        </w:trPr>
+        <w:tc>
+          <w:tcPr>
+            <w:tcW w:type="dxa" w:w="1905"/>
+            <w:vAlign w:val="center"/>
+            <w:shd w:fill="F5F5F5"/>
+          </w:tcPr>
+          <w:p>
+            <w:pPr>
+              <w:spacing w:after="80" w:before="80" w:line="264" w:lineRule="auto"/>
+            </w:pPr>
+            <w:r>
+              <w:rPr>
+                <w:sz w:val="16"/>
+              </w:rPr>
+              <w:t>Main Hall</w:t>
+            </w:r>
+          </w:p>
+        </w:tc>
+        <w:tc>
+          <w:tcPr>
+            <w:tcW w:type="dxa" w:w="1905"/>
+            <w:vAlign w:val="center"/>
+            <w:shd w:fill="F5F5F5"/>
+          </w:tcPr>
+          <w:p>
+            <w:pPr>
+              <w:spacing w:after="80" w:before="80" w:line="264" w:lineRule="auto"/>
+            </w:pPr>
+            <w:r>
+              <w:rPr>
+                <w:sz w:val="16"/>
+              </w:rPr>
+              <w:t>VIP</w:t>
+            </w:r>
+          </w:p>
+        </w:tc>
+        <w:tc>
+          <w:tcPr>
+            <w:tcW w:type="dxa" w:w="1905"/>
+            <w:vAlign w:val="center"/>
+            <w:shd w:fill="F5F5F5"/>
+          </w:tcPr>
+          <w:p>
+            <w:pPr>
+              <w:spacing w:after="80" w:before="80" w:line="264" w:lineRule="auto"/>
+            </w:pPr>
+            <w:r>
+              <w:rPr>
+                <w:sz w:val="16"/>
+              </w:rPr>
+              <w:t>490 Kč</w:t>
+            </w:r>
+          </w:p>
+        </w:tc>
+        <w:tc>
+          <w:tcPr>
+            <w:tcW w:type="dxa" w:w="1905"/>
+            <w:vAlign w:val="center"/>
+            <w:shd w:fill="F5F5F5"/>
+          </w:tcPr>
+          <w:p>
+            <w:pPr>
+              <w:spacing w:after="80" w:before="80" w:line="264" w:lineRule="auto"/>
+            </w:pPr>
+            <w:r>
+              <w:rPr>
+                <w:sz w:val="16"/>
+              </w:rPr>
+              <w:t>980 Kč</w:t>
+            </w:r>
+          </w:p>
+        </w:tc>
+        <w:tc>
+          <w:tcPr>
+            <w:tcW w:type="dxa" w:w="1905"/>
+            <w:vAlign w:val="center"/>
+            <w:shd w:fill="F5F5F5"/>
+          </w:tcPr>
+          <w:p>
+            <w:pPr>
+              <w:spacing w:after="80" w:before="80" w:line="264" w:lineRule="auto"/>
+            </w:pPr>
+            <w:r>
+              <w:rPr>
+                <w:sz w:val="16"/>
+              </w:rPr>
+              <w:t>1 290 Kč</w:t>
+            </w:r>
+          </w:p>
+        </w:tc>
+      </w:tr>
+      <w:tr>
+        <w:trPr>
+          <w:cantSplit/>
+        </w:trPr>
+        <w:tc>
+          <w:tcPr>
+            <w:tcW w:type="dxa" w:w="1905"/>
+            <w:vAlign w:val="center"/>
+          </w:tcPr>
+          <w:p>
+            <w:pPr>
+              <w:spacing w:after="80" w:before="80" w:line="264" w:lineRule="auto"/>
+            </w:pPr>
+            <w:r>
+              <w:rPr>
+                <w:sz w:val="16"/>
+              </w:rPr>
+              <w:t>Main Hall</w:t>
+            </w:r>
+          </w:p>
+        </w:tc>
+        <w:tc>
+          <w:tcPr>
+            <w:tcW w:type="dxa" w:w="1905"/>
+            <w:vAlign w:val="center"/>
+          </w:tcPr>
+          <w:p>
+            <w:pPr>
+              <w:spacing w:after="80" w:before="80" w:line="264" w:lineRule="auto"/>
+            </w:pPr>
+            <w:r>
+              <w:rPr>
+                <w:sz w:val="16"/>
+              </w:rPr>
+              <w:t>Regular</w:t>
+            </w:r>
+          </w:p>
+        </w:tc>
+        <w:tc>
+          <w:tcPr>
+            <w:tcW w:type="dxa" w:w="1905"/>
+            <w:vAlign w:val="center"/>
+          </w:tcPr>
+          <w:p>
+            <w:pPr>
+              <w:spacing w:after="80" w:before="80" w:line="264" w:lineRule="auto"/>
+            </w:pPr>
+            <w:r>
+              <w:rPr>
+                <w:sz w:val="16"/>
+              </w:rPr>
+              <w:t>290 Kč</w:t>
+            </w:r>
+          </w:p>
+        </w:tc>
+        <w:tc>
+          <w:tcPr>
+            <w:tcW w:type="dxa" w:w="1905"/>
+            <w:vAlign w:val="center"/>
+          </w:tcPr>
+          <w:p>
+            <w:pPr>
+              <w:spacing w:after="80" w:before="80" w:line="264" w:lineRule="auto"/>
+            </w:pPr>
+            <w:r>
+              <w:rPr>
+                <w:sz w:val="16"/>
+              </w:rPr>
+              <w:t>580 Kč</w:t>
+            </w:r>
+          </w:p>
+        </w:tc>
+        <w:tc>
+          <w:tcPr>
+            <w:tcW w:type="dxa" w:w="1905"/>
+            <w:vAlign w:val="center"/>
+          </w:tcPr>
+          <w:p>
+            <w:pPr>
+              <w:spacing w:after="80" w:before="80" w:line="264" w:lineRule="auto"/>
+            </w:pPr>
+            <w:r>
+              <w:rPr>
+                <w:sz w:val="16"/>
+              </w:rPr>
+              <w:t>790 Kč</w:t>
+            </w:r>
+          </w:p>
+        </w:tc>
+      </w:tr>
+      <w:tr>
+        <w:trPr>
+          <w:cantSplit/>
+        </w:trPr>
+        <w:tc>
+          <w:tcPr>
+            <w:tcW w:type="dxa" w:w="1905"/>
+            <w:vAlign w:val="center"/>
+            <w:shd w:fill="F5F5F5"/>
+          </w:tcPr>
+          <w:p>
+            <w:pPr>
+              <w:spacing w:after="80" w:before="80" w:line="264" w:lineRule="auto"/>
+            </w:pPr>
+            <w:r>
+              <w:rPr>
+                <w:sz w:val="16"/>
+              </w:rPr>
+              <w:t>Main Hall</w:t>
+            </w:r>
+          </w:p>
+        </w:tc>
+        <w:tc>
+          <w:tcPr>
+            <w:tcW w:type="dxa" w:w="1905"/>
+            <w:vAlign w:val="center"/>
+            <w:shd w:fill="F5F5F5"/>
+          </w:tcPr>
+          <w:p>
+            <w:pPr>
+              <w:spacing w:after="80" w:before="80" w:line="264" w:lineRule="auto"/>
+            </w:pPr>
+            <w:r>
+              <w:rPr>
+                <w:sz w:val="16"/>
+              </w:rPr>
+              <w:t>Stání</w:t>
+            </w:r>
+          </w:p>
+        </w:tc>
+        <w:tc>
+          <w:tcPr>
+            <w:tcW w:type="dxa" w:w="1905"/>
+            <w:vAlign w:val="center"/>
+            <w:shd w:fill="F5F5F5"/>
+          </w:tcPr>
+          <w:p>
+            <w:pPr>
+              <w:spacing w:after="80" w:before="80" w:line="264" w:lineRule="auto"/>
+            </w:pPr>
+            <w:r>
+              <w:rPr>
+                <w:sz w:val="16"/>
+              </w:rPr>
+              <w:t>150 Kč</w:t>
+            </w:r>
+          </w:p>
+        </w:tc>
+        <w:tc>
+          <w:tcPr>
+            <w:tcW w:type="dxa" w:w="1905"/>
+            <w:vAlign w:val="center"/>
+            <w:shd w:fill="F5F5F5"/>
+          </w:tcPr>
+          <w:p>
+            <w:pPr>
+              <w:spacing w:after="80" w:before="80" w:line="264" w:lineRule="auto"/>
+            </w:pPr>
+            <w:r>
+              <w:rPr>
+                <w:sz w:val="16"/>
+              </w:rPr>
+              <w:t>300 Kč</w:t>
+            </w:r>
+          </w:p>
+        </w:tc>
+        <w:tc>
+          <w:tcPr>
+            <w:tcW w:type="dxa" w:w="1905"/>
+            <w:vAlign w:val="center"/>
+            <w:shd w:fill="F5F5F5"/>
+          </w:tcPr>
+          <w:p>
+            <w:pPr>
+              <w:spacing w:after="80" w:before="80" w:line="264" w:lineRule="auto"/>
+            </w:pPr>
+            <w:r>
+              <w:rPr>
+                <w:sz w:val="16"/>
+              </w:rPr>
+              <w:t>390 Kč</w:t>
+            </w:r>
+          </w:p>
+        </w:tc>
+      </w:tr>
+      <w:tr>
+        <w:trPr>
+          <w:cantSplit/>
+        </w:trPr>
+        <w:tc>
+          <w:tcPr>
+            <w:tcW w:type="dxa" w:w="1905"/>
+            <w:vAlign w:val="center"/>
+          </w:tcPr>
+          <w:p>
+            <w:pPr>
+              <w:spacing w:after="80" w:before="80" w:line="264" w:lineRule="auto"/>
+            </w:pPr>
+            <w:r>
+              <w:rPr>
+                <w:sz w:val="16"/>
+              </w:rPr>
+              <w:t>River Stage</w:t>
+            </w:r>
+          </w:p>
+        </w:tc>
+        <w:tc>
+          <w:tcPr>
+            <w:tcW w:type="dxa" w:w="1905"/>
+            <w:vAlign w:val="center"/>
+          </w:tcPr>
+          <w:p>
+            <w:pPr>
+              <w:spacing w:after="80" w:before="80" w:line="264" w:lineRule="auto"/>
+            </w:pPr>
+            <w:r>
+              <w:rPr>
+                <w:sz w:val="16"/>
+              </w:rPr>
+              <w:t>Stání</w:t>
+            </w:r>
+          </w:p>
+        </w:tc>
+        <w:tc>
+          <w:tcPr>
+            <w:tcW w:type="dxa" w:w="1905"/>
+            <w:vAlign w:val="center"/>
+          </w:tcPr>
+          <w:p>
+            <w:pPr>
+              <w:spacing w:after="80" w:before="80" w:line="264" w:lineRule="auto"/>
+            </w:pPr>
+            <w:r>
+              <w:rPr>
+                <w:sz w:val="16"/>
+              </w:rPr>
+              <w:t>110 Kč</w:t>
+            </w:r>
+          </w:p>
+        </w:tc>
+        <w:tc>
+          <w:tcPr>
+            <w:tcW w:type="dxa" w:w="1905"/>
+            <w:vAlign w:val="center"/>
+          </w:tcPr>
+          <w:p>
+            <w:pPr>
+              <w:spacing w:after="80" w:before="80" w:line="264" w:lineRule="auto"/>
+            </w:pPr>
+            <w:r>
+              <w:rPr>
+                <w:sz w:val="16"/>
+              </w:rPr>
+              <w:t>220 Kč</w:t>
+            </w:r>
+          </w:p>
+        </w:tc>
+        <w:tc>
+          <w:tcPr>
+            <w:tcW w:type="dxa" w:w="1905"/>
+            <w:vAlign w:val="center"/>
+          </w:tcPr>
+          <w:p>
+            <w:pPr>
+              <w:spacing w:after="80" w:before="80" w:line="264" w:lineRule="auto"/>
+            </w:pPr>
+            <w:r>
+              <w:rPr>
+                <w:sz w:val="16"/>
+              </w:rPr>
+              <w:t>290 Kč</w:t>
+            </w:r>
+          </w:p>
+        </w:tc>
+      </w:tr>
+      <w:tr>
+        <w:trPr>
+          <w:cantSplit/>
+        </w:trPr>
+        <w:tc>
+          <w:tcPr>
+            <w:tcW w:type="dxa" w:w="1905"/>
+            <w:vAlign w:val="center"/>
+            <w:shd w:fill="F5F5F5"/>
+          </w:tcPr>
+          <w:p>
+            <w:pPr>
+              <w:spacing w:after="80" w:before="80" w:line="264" w:lineRule="auto"/>
+            </w:pPr>
+            <w:r>
+              <w:rPr>
+                <w:sz w:val="16"/>
+              </w:rPr>
+              <w:t>Club Stage</w:t>
+            </w:r>
+          </w:p>
+        </w:tc>
+        <w:tc>
+          <w:tcPr>
+            <w:tcW w:type="dxa" w:w="1905"/>
+            <w:vAlign w:val="center"/>
+            <w:shd w:fill="F5F5F5"/>
+          </w:tcPr>
+          <w:p>
+            <w:pPr>
+              <w:spacing w:after="80" w:before="80" w:line="264" w:lineRule="auto"/>
+            </w:pPr>
+            <w:r>
+              <w:rPr>
+                <w:sz w:val="16"/>
+              </w:rPr>
+              <w:t>Stání</w:t>
+            </w:r>
+          </w:p>
+        </w:tc>
+        <w:tc>
+          <w:tcPr>
+            <w:tcW w:type="dxa" w:w="1905"/>
+            <w:vAlign w:val="center"/>
+            <w:shd w:fill="F5F5F5"/>
+          </w:tcPr>
+          <w:p>
+            <w:pPr>
+              <w:spacing w:after="80" w:before="80" w:line="264" w:lineRule="auto"/>
+            </w:pPr>
+            <w:r>
+              <w:rPr>
+                <w:sz w:val="16"/>
+              </w:rPr>
+              <w:t>90 Kč</w:t>
+            </w:r>
+          </w:p>
+        </w:tc>
+        <w:tc>
+          <w:tcPr>
+            <w:tcW w:type="dxa" w:w="1905"/>
+            <w:vAlign w:val="center"/>
+            <w:shd w:fill="F5F5F5"/>
+          </w:tcPr>
+          <w:p>
+            <w:pPr>
+              <w:spacing w:after="80" w:before="80" w:line="264" w:lineRule="auto"/>
+            </w:pPr>
+            <w:r>
+              <w:rPr>
+                <w:sz w:val="16"/>
+              </w:rPr>
+              <w:t>180 Kč</w:t>
+            </w:r>
+          </w:p>
+        </w:tc>
+        <w:tc>
+          <w:tcPr>
+            <w:tcW w:type="dxa" w:w="1905"/>
+            <w:vAlign w:val="center"/>
+            <w:shd w:fill="F5F5F5"/>
+          </w:tcPr>
+          <w:p>
+            <w:pPr>
+              <w:spacing w:after="80" w:before="80" w:line="264" w:lineRule="auto"/>
+            </w:pPr>
+            <w:r>
+              <w:rPr>
+                <w:sz w:val="16"/>
+              </w:rPr>
+              <w:t>240 Kč</w:t>
+            </w:r>
+          </w:p>
+        </w:tc>
+      </w:tr>
+    </w:tbl>
+    <w:p>
+      <w:pPr>
+        <w:spacing w:after="0"/>
+      </w:pPr>
+    </w:p>
+    <w:p>
+      <w:pPr/>
+      <w:r>
+        <w:t>Košík místo ještě nerezervuje. Dostupnost pro další výběr zohlední prodané vstupy i obsah košíku; před dokončením se znovu kontroluje cena, překryv dnů, fyzická místa, dotčené kapacity scén a kemp. Nákup 1. a 3. dne sám neobsadí</w:t>
+      </w:r>
+    </w:p>
+    <w:p>
+      <w:pPr>
+        <w:pStyle w:val="ListNumber"/>
+      </w:pPr>
+      <w:r>
+        <w:t>den. Jde o kapacitu na den, nikoli aktuální počet lidí u pódia. Místní</w:t>
+      </w:r>
+    </w:p>
+    <w:p>
+      <w:pPr/>
+      <w:r>
+        <w:t xml:space="preserve">data nejsou sdílená mezi zařízeními. Objednávky staršího ročníku zůstávají v historii, ale neblokují aktuální ročník. U záznamů bez </w:t>
+      </w:r>
+      <w:r>
+        <w:rPr>
+          <w:rFonts w:ascii="Consolas" w:hAnsi="Consolas"/>
+          <w:sz w:val="18"/>
+        </w:rPr>
+        <w:t>venueId</w:t>
+      </w:r>
+      <w:r>
+        <w:t xml:space="preserve"> se zachová původní význam všech scén; </w:t>
+      </w:r>
+      <w:r>
+        <w:rPr>
+          <w:rFonts w:ascii="Consolas" w:hAnsi="Consolas"/>
+          <w:sz w:val="18"/>
+        </w:rPr>
+        <w:t>scope</w:t>
+      </w:r>
+      <w:r>
+        <w:t xml:space="preserve"> nadále označuje délku, ne scénu.</w:t>
+      </w:r>
     </w:p>
     <w:p>
       <w:pPr/>
@@ -3166,7 +4165,7 @@
     <w:p>
       <w:pPr/>
       <w:r>
-        <w:t>Registrace má jméno, příjmení, e-mail, telefon, heslo a jeho potvrzení. Profil dovoluje upravit kontakt bez změny údajů historické objednávky. Heslo se ukládá jako PBKDF2-SHA256 hash se 120 000 iteracemi a náhodnou solí; nejde o produkční autentizaci ani ověření vlastnictví e-mailu. Přihlášení vyprší za sedm dnů.</w:t>
+        <w:t>Registrace má jméno, příjmení, e-mail, telefon, heslo a jeho potvrzení. Profil dovoluje upravit kontakt bez změny údajů historické objednávky. Heslo se ukládá jako PBKDF2-SHA256 hash se 120 000 iteracemi a náhodnou solí; nejde o produkční autentizaci ani ověření vlastnictví e-mailu. Přihlášení vyprší za sedm dnů; toto vypršení kontroluje klientská aplikace.</w:t>
       </w:r>
     </w:p>
     <w:p>
@@ -3186,7 +4185,43 @@
     <w:p>
       <w:pPr/>
       <w:r>
-        <w:t>Volba soukromí platí 180 dnů. Google Maps se vloží až po souhlasu s externími mapami; po odvolání se odstraní. Vlastní SVG plánek a textová doprava fungují bez tohoto souhlasu. Analytika a reklamní sledování se nepoužívají.</w:t>
+        <w:t xml:space="preserve">Web sám nenastavuje HTTP cookies a nemá serverovou session. </w:t>
+      </w:r>
+      <w:r>
+        <w:rPr>
+          <w:rFonts w:ascii="Consolas" w:hAnsi="Consolas"/>
+          <w:sz w:val="18"/>
+        </w:rPr>
+        <w:t>sessionStorage</w:t>
+      </w:r>
+      <w:r>
+        <w:t xml:space="preserve"> drží identifikátor relace aktuální karty a poslední objednávku hosta; obnovení stránky ho zachová, nová nezávislá relace data nesdílí. </w:t>
+      </w:r>
+      <w:r>
+        <w:rPr>
+          <w:rFonts w:ascii="Consolas" w:hAnsi="Consolas"/>
+          <w:sz w:val="18"/>
+        </w:rPr>
+        <w:t>localStorage</w:t>
+      </w:r>
+      <w:r>
+        <w:t xml:space="preserve"> zůstává i po zavření prohlížeče, dokud jej uživatel nebo prohlížeč nevymaže.</w:t>
+      </w:r>
+    </w:p>
+    <w:p>
+      <w:pPr/>
+      <w:r>
+        <w:t xml:space="preserve">Volba soukromí v </w:t>
+      </w:r>
+      <w:r>
+        <w:rPr>
+          <w:rFonts w:ascii="Consolas" w:hAnsi="Consolas"/>
+          <w:sz w:val="18"/>
+        </w:rPr>
+        <w:t>localStorage</w:t>
+      </w:r>
+      <w:r>
+        <w:t xml:space="preserve"> platí 180 dnů. Lišta tedy nepředstavuje databázi cookies, ale ovládání místního ukládání a externího obsahu. Google Maps se vloží až po souhlasu s externími mapami; po odvolání se odstraní. Vlastní SVG plánek a textová doprava fungují bez tohoto souhlasu. Analytika a reklamní sledování se nepoužívají.</w:t>
       </w:r>
     </w:p>
     <w:p>
@@ -4633,7 +5668,7 @@
               <w:rPr>
                 <w:sz w:val="16"/>
               </w:rPr>
-              <w:t>Aktuální požadavek na podklady</w:t>
+              <w:t>Požadavek na samostatné scény a přehledný program</w:t>
             </w:r>
           </w:p>
         </w:tc>
@@ -4651,7 +5686,7 @@
               <w:rPr>
                 <w:sz w:val="16"/>
               </w:rPr>
-              <w:t>Zjednodušit prezentace a dokumentaci, doplnit autory a návod</w:t>
+              <w:t>Rozdílné kapacity, levnější vstup jedné scény, postupné večerní koncerty a upozornění na kolize</w:t>
             </w:r>
           </w:p>
         </w:tc>
@@ -4660,6 +5695,62 @@
             <w:tcW w:type="dxa" w:w="3175"/>
             <w:vAlign w:val="center"/>
             <w:shd w:fill="F5F5F5"/>
+          </w:tcPr>
+          <w:p>
+            <w:pPr>
+              <w:spacing w:after="80" w:before="80" w:line="264" w:lineRule="auto"/>
+            </w:pPr>
+            <w:r>
+              <w:rPr>
+                <w:sz w:val="16"/>
+              </w:rPr>
+              <w:t>Srozumitelný rozsah vstupu bez zkrácení plných setů; ověření cen, kapacit a časů</w:t>
+            </w:r>
+          </w:p>
+        </w:tc>
+      </w:tr>
+      <w:tr>
+        <w:trPr>
+          <w:cantSplit/>
+        </w:trPr>
+        <w:tc>
+          <w:tcPr>
+            <w:tcW w:type="dxa" w:w="3175"/>
+            <w:vAlign w:val="center"/>
+          </w:tcPr>
+          <w:p>
+            <w:pPr>
+              <w:spacing w:after="80" w:before="80" w:line="264" w:lineRule="auto"/>
+            </w:pPr>
+            <w:r>
+              <w:rPr>
+                <w:sz w:val="16"/>
+              </w:rPr>
+              <w:t>Aktuální požadavek na podklady</w:t>
+            </w:r>
+          </w:p>
+        </w:tc>
+        <w:tc>
+          <w:tcPr>
+            <w:tcW w:type="dxa" w:w="3175"/>
+            <w:vAlign w:val="center"/>
+          </w:tcPr>
+          <w:p>
+            <w:pPr>
+              <w:spacing w:after="80" w:before="80" w:line="264" w:lineRule="auto"/>
+            </w:pPr>
+            <w:r>
+              <w:rPr>
+                <w:sz w:val="16"/>
+              </w:rPr>
+              <w:t>Zjednodušit prezentace a dokumentaci, doplnit autory a návod</w:t>
+            </w:r>
+          </w:p>
+        </w:tc>
+        <w:tc>
+          <w:tcPr>
+            <w:tcW w:type="dxa" w:w="3175"/>
+            <w:vAlign w:val="center"/>
           </w:tcPr>
           <w:p>
             <w:pPr>
@@ -5496,7 +6587,7 @@
               <w:rPr>
                 <w:sz w:val="16"/>
               </w:rPr>
-              <w:t>„Připrav podklady podle cvičení.“</w:t>
+              <w:t>„Navrhni kapacity scén a program, který dává smysl.“</w:t>
             </w:r>
           </w:p>
         </w:tc>
@@ -5514,7 +6605,7 @@
               <w:rPr>
                 <w:sz w:val="16"/>
               </w:rPr>
-              <w:t>Přijato členění; odmítnut vymyšlený cizí posudek a historie týmu</w:t>
+              <w:t>Přijaty různé kapacity; odmítnuto neomezené stání a slib stihnout všech 60 plných setů</w:t>
             </w:r>
           </w:p>
         </w:tc>
@@ -5523,6 +6614,62 @@
             <w:tcW w:type="dxa" w:w="3175"/>
             <w:vAlign w:val="center"/>
             <w:shd w:fill="F5F5F5"/>
+          </w:tcPr>
+          <w:p>
+            <w:pPr>
+              <w:spacing w:after="80" w:before="80" w:line="264" w:lineRule="auto"/>
+            </w:pPr>
+            <w:r>
+              <w:rPr>
+                <w:sz w:val="16"/>
+              </w:rPr>
+              <w:t>Kapacity z katalogu, společné a samostatné vstupy, stejné sedadlo a návaznost večerních koncertů</w:t>
+            </w:r>
+          </w:p>
+        </w:tc>
+      </w:tr>
+      <w:tr>
+        <w:trPr>
+          <w:cantSplit/>
+        </w:trPr>
+        <w:tc>
+          <w:tcPr>
+            <w:tcW w:type="dxa" w:w="3175"/>
+            <w:vAlign w:val="center"/>
+          </w:tcPr>
+          <w:p>
+            <w:pPr>
+              <w:spacing w:after="80" w:before="80" w:line="264" w:lineRule="auto"/>
+            </w:pPr>
+            <w:r>
+              <w:rPr>
+                <w:sz w:val="16"/>
+              </w:rPr>
+              <w:t>„Připrav podklady podle cvičení.“</w:t>
+            </w:r>
+          </w:p>
+        </w:tc>
+        <w:tc>
+          <w:tcPr>
+            <w:tcW w:type="dxa" w:w="3175"/>
+            <w:vAlign w:val="center"/>
+          </w:tcPr>
+          <w:p>
+            <w:pPr>
+              <w:spacing w:after="80" w:before="80" w:line="264" w:lineRule="auto"/>
+            </w:pPr>
+            <w:r>
+              <w:rPr>
+                <w:sz w:val="16"/>
+              </w:rPr>
+              <w:t>Přijato členění; odmítnut vymyšlený cizí posudek a historie týmu</w:t>
+            </w:r>
+          </w:p>
+        </w:tc>
+        <w:tc>
+          <w:tcPr>
+            <w:tcW w:type="dxa" w:w="3175"/>
+            <w:vAlign w:val="center"/>
           </w:tcPr>
           <w:p>
             <w:pPr>

</xml_diff>

<commit_message>
feat: streamline contextual ticket purchases and data delivery
</commit_message>
<xml_diff>
--- a/docs/documentation.docx
+++ b/docs/documentation.docx
@@ -173,7 +173,7 @@
     <w:p>
       <w:pPr/>
       <w:r>
-        <w:t>Prague Pulse Fest je fiktivní městský hudební festival pro 1.–3. srpna 2027. Web propojuje program, účinkující, scény, vyhledávání a praktické informace. Navazuje na původní projekt Značkovací jazyky a jeho XML datový základ. Výstup pro Webdesign tvoří čistě klientský web a podklady ke cvičením.</w:t>
+        <w:t>Prague Pulse Fest je fiktivní městský hudební festival pro 1.–3. srpna 2027. Web propojuje program, účinkující, scény, vyhledávání a praktické informace. Využívá XML datový základ se stabilními ID. Výstup pro Webdesign tvoří čistě klientský web a podklady ke cvičením.</w:t>
       </w:r>
     </w:p>
     <w:tbl>
@@ -1475,19 +1475,17 @@
           <w:rFonts w:ascii="Consolas" w:hAnsi="Consolas"/>
           <w:sz w:val="18"/>
         </w:rPr>
-        <w:t>data/festival.xml + festival.xsd</w:t>
-        <w:br/>
-        <w:t xml:space="preserve">          ↓ XSLT transformace a ověření</w:t>
-        <w:br/>
-        <w:t xml:space="preserve">       API/json/*.json</w:t>
+        <w:t>data/festival.xml + data/festival.xsd</w:t>
         <w:br/>
         <w:t xml:space="preserve">          ↓ tools/generate_data.py</w:t>
         <w:br/>
-        <w:t xml:space="preserve">       web/js/data.js</w:t>
+        <w:t xml:space="preserve">     data/json/ — festival, venues, performers, events</w:t>
         <w:br/>
-        <w:t xml:space="preserve">          ↓ JavaScript v prohlížeči</w:t>
+        <w:t xml:space="preserve">     web/js/data.js — stejný obsah pro prohlížeč</w:t>
         <w:br/>
-        <w:t xml:space="preserve">     program, profily, scény, tarify</w:t>
+        <w:t xml:space="preserve">          ↓</w:t>
+        <w:br/>
+        <w:t xml:space="preserve">     program, filtry, detaily, ceny a kapacity</w:t>
       </w:r>
     </w:p>
     <w:p>
@@ -1501,7 +1499,7 @@
         <w:t>data/festival.xml</w:t>
       </w:r>
       <w:r>
-        <w:t xml:space="preserve"> je hlavní datový zdroj. </w:t>
+        <w:t xml:space="preserve"> je hlavní datový zdroj. XSD kontroluje strukturu, typy a reference. Generátor používá standardní knihovnu Pythonu a z celého XML připraví čtyři JSON exporty, webová data a přesné kořenové kopie </w:t>
       </w:r>
       <w:r>
         <w:rPr>
@@ -1511,26 +1509,17 @@
         <w:t>data.xml</w:t>
       </w:r>
       <w:r>
-        <w:t xml:space="preserve"> je identická kopie pro předepsanou strukturu odevzdání. XSD ověřuje strukturu, typy a reference. Sedm XSLT transformací vytváří JSON ukázky; JSON Schema a OpenAPI popisují jejich strukturu. Složka </w:t>
+        <w:t xml:space="preserve"> a </w:t>
       </w:r>
       <w:r>
         <w:rPr>
           <w:rFonts w:ascii="Consolas" w:hAnsi="Consolas"/>
           <w:sz w:val="18"/>
         </w:rPr>
-        <w:t>API/</w:t>
+        <w:t>festival.xsd</w:t>
       </w:r>
       <w:r>
-        <w:t xml:space="preserve"> obsahuje soubory, </w:t>
-      </w:r>
-      <w:r>
-        <w:rPr>
-          <w:b/>
-        </w:rPr>
-        <w:t>nikoli běžící backend</w:t>
-      </w:r>
-      <w:r>
-        <w:t>.</w:t>
+        <w:t xml:space="preserve"> pro odevzdání.</w:t>
       </w:r>
     </w:p>
     <w:p>
@@ -1544,7 +1533,7 @@
         <w:t>web/js/data.js</w:t>
       </w:r>
       <w:r>
-        <w:t xml:space="preserve"> při otevření stránky nastaví </w:t>
+        <w:t xml:space="preserve"> nastaví </w:t>
       </w:r>
       <w:r>
         <w:rPr>
@@ -1554,17 +1543,7 @@
         <w:t>window.FESTIVAL_DATA</w:t>
       </w:r>
       <w:r>
-        <w:t xml:space="preserve">. Je to obyčejný JavaScript s vloženými daty, připravený z úplného XML a JSON exportů. Web proto nemusí při spuštění načítat XML přes </w:t>
-      </w:r>
-      <w:r>
-        <w:rPr>
-          <w:rFonts w:ascii="Consolas" w:hAnsi="Consolas"/>
-          <w:sz w:val="18"/>
-        </w:rPr>
-        <w:t>fetch</w:t>
-      </w:r>
-      <w:r>
-        <w:t xml:space="preserve"> ani provozovat API. Všech 60 interpretů je přítomno i tehdy, když ukázkový JSON endpoint předvádí stránkování.</w:t>
+        <w:t>. Hotový web tak používá stejný obsah bez síťového načítání lokálního XML nebo JSON. Odvozené exporty se samostatně neupravují. Všechny seznamy obsahují úplná data, nikoli stránkovanou ukázku.</w:t>
       </w:r>
     </w:p>
     <w:p>
@@ -2684,29 +2663,61 @@
         <w:pStyle w:val="Heading2"/>
       </w:pPr>
       <w:r>
-        <w:t>3.3 JSON není totéž co JSON-LD</w:t>
+        <w:t>3.3 Výběr a propojení objektů</w:t>
       </w:r>
     </w:p>
     <w:p>
       <w:pPr/>
       <w:r>
-        <w:t xml:space="preserve">JSON soubory skutečně existují v </w:t>
+        <w:t>Filtry dne a scény porovnávají ID. Textový filtr a vyhledávání normalizují diakritiku a velikost písmen a používají shodu podřetězce. Výsledný program se řadí podle dne a začátku. Osobní program ukládá ID, nikoli kopie koncertů.</w:t>
+      </w:r>
+    </w:p>
+    <w:p>
+      <w:pPr/>
+      <w:r>
+        <w:t xml:space="preserve">Detail interpreta propojí </w:t>
       </w:r>
       <w:r>
         <w:rPr>
           <w:rFonts w:ascii="Consolas" w:hAnsi="Consolas"/>
           <w:sz w:val="18"/>
         </w:rPr>
-        <w:t>API/json/</w:t>
+        <w:t>performerIds</w:t>
       </w:r>
       <w:r>
-        <w:t>; procenta jazyků na GitHubu nejsou inventář dat ani známka kvality. JavaScript zahrnuje také přibalená data a knihovny, Python pomocné nástroje a testy. Jejich velikost nevypovídá o tom, co je nutné k otevření webu.</w:t>
+        <w:t xml:space="preserve"> vystoupení s ID profilu. Odkaz na nákup převezme </w:t>
+      </w:r>
+      <w:r>
+        <w:rPr>
+          <w:rFonts w:ascii="Consolas" w:hAnsi="Consolas"/>
+          <w:sz w:val="18"/>
+        </w:rPr>
+        <w:t>dayId</w:t>
+      </w:r>
+      <w:r>
+        <w:t xml:space="preserve"> a </w:t>
+      </w:r>
+      <w:r>
+        <w:rPr>
+          <w:rFonts w:ascii="Consolas" w:hAnsi="Consolas"/>
+          <w:sz w:val="18"/>
+        </w:rPr>
+        <w:t>venueId</w:t>
+      </w:r>
+      <w:r>
+        <w:t xml:space="preserve"> konkrétního vystoupení a předvolí jednodenní vstup. Nevybírá vstup podle žánru ani pořadí prvků v seznamu. Návštěvník může rozsah před vložením do košíku změnit.</w:t>
       </w:r>
     </w:p>
     <w:p>
       <w:pPr/>
       <w:r>
-        <w:t xml:space="preserve">JSON-LD je zde vložený blok </w:t>
+        <w:t>Kapacita se odvozuje z platných objednávek aktuálního ročníku pro každou scénu a den. Přehled ukazuje celkovou kapacitu, prodané a zbývající vstupy; nejde o počet lidí právě přítomných před pódiem.</w:t>
+      </w:r>
+    </w:p>
+    <w:p>
+      <w:pPr/>
+      <w:r>
+        <w:t xml:space="preserve">JSON-LD v úvodu je blok </w:t>
       </w:r>
       <w:r>
         <w:rPr>
@@ -2716,7 +2727,7 @@
         <w:t>&lt;script type="application/ld+json"&gt;</w:t>
       </w:r>
       <w:r>
-        <w:t xml:space="preserve"> na úvodu. Popisuje entitu </w:t>
+        <w:t xml:space="preserve"> s typem </w:t>
       </w:r>
       <w:r>
         <w:rPr>
@@ -2726,7 +2737,7 @@
         <w:t>Festival</w:t>
       </w:r>
       <w:r>
-        <w:t>, její viditelný název, datum a místo pro vyhledávače. Neslouží jako úložiště uživatelů a nenahrazuje festivalová data. Neuvádí vymyšlená hodnocení ani potvrzené nabídky skutečného prodeje.</w:t>
+        <w:t>: viditelný název, termín a místo pro vyhledávače. Nenahrazuje XML ani úložiště účtů.</w:t>
       </w:r>
     </w:p>
     <w:p>
@@ -2775,10 +2786,10 @@
         <w:rPr>
           <w:b/>
         </w:rPr>
-        <w:t>S2 — interpret:</w:t>
+        <w:t>S2 — interpret a vstup:</w:t>
       </w:r>
       <w:r>
-        <w:t xml:space="preserve"> vyhledat DARKZY, otevřít medailonek a odkaz do programu. Výsledek a čas musí odpovídat stejné entitě v XML.</w:t>
+        <w:t xml:space="preserve"> vyhledat DARKZY, otevřít detail a příslušný vstup. Předvolený den a Club Stage musí odpovídat vystoupení v XML.</w:t>
       </w:r>
     </w:p>
     <w:p>
@@ -2843,7 +2854,7 @@
         <w:t>minmax()</w:t>
       </w:r>
       <w:r>
-        <w:t xml:space="preserve"> přizpůsobují obsah prostoru. Tmavá identita kombinuje vlastní typografické logo a oranžové akce. Inspirace festivalovými weby nepřebírá cizí logo, fotografie ani kód.</w:t>
+        <w:t xml:space="preserve"> přizpůsobují obsah prostoru. Tmavá identita kombinuje vlastní typografické logo a oranžové akce. Inspirace festivalovými weby zachovává vlastní značku a rozložení; použité fotografie mají samostatně doložené zdroje a licence.</w:t>
       </w:r>
     </w:p>
     <w:p>
@@ -3217,6 +3228,18 @@
     <w:p>
       <w:pPr/>
       <w:r>
+        <w:t>Kliknutí na sedadlo přidá nebo odebere místo a současně změní počet osob a cenu; počet se nezadává druhým ovládáním. U stání se počet zadává. Dvoudenní vstup vyžaduje dvě výslovně zvolená různá data. Dokud nejsou obě vyplněná, nelze výběr přidat do košíku.</w:t>
+      </w:r>
+    </w:p>
+    <w:p>
+      <w:pPr/>
+      <w:r>
+        <w:t>Cena košíku se vždy vypočítává z aktuálních položek. Odebrání znovu spočítá mezisoučet, promo, zahrnutou daň a celkovou částku, včetně přechodu na prázdný košík.</w:t>
+      </w:r>
+    </w:p>
+    <w:p>
+      <w:pPr/>
+      <w:r>
         <w:t>Výběr dovoluje nejvýše osm osob najednou, celá objednávka nejvýše 264 vstupenek. Vyšší počet se odmítne před přidáním i při dokončení objednávky, aby každou přijatou objednávku bylo možné stáhnout jako PDF.</w:t>
       </w:r>
     </w:p>
@@ -4151,7 +4174,13 @@
     <w:p>
       <w:pPr/>
       <w:r>
-        <w:t>Sedm platebních metod představuje průchod formulářem bez platební služby. PDF vzniká lokálně přes jsPDF: každá vstupenka má vlastní stránku, přesná data, místo, číslo objednávky a QR identifikátor. Kemp přidává poukaz. QR nemá serverové ověření. Skutečné karetní údaje se nevyplňují a e-mail se automaticky neposílá.</w:t>
+        <w:t>Sedm platebních metod představuje průchod formulářem bez platební služby. PDF vzniká přes jsPDF z uloženého objektu objednávky. Každá vstupenka má vlastní stránku, datum nákupu, jméno kupujícího, číslo objednávky, přesnou platnost, scénu, kategorii, místo a QR identifikátor. Zobrazuje cenu konkrétní vstupenky, použitý promo kód a odpovídající část slevy.</w:t>
+      </w:r>
+    </w:p>
+    <w:p>
+      <w:pPr/>
+      <w:r>
+        <w:t>Sleva se mezi položky rozdělí v celých haléřích poměrem jejich cen a metodou největšího zbytku. Součet částí tak odpovídá slevě objednávky. Z ceny po slevě se určí základ a již zahrnutá 12% daň. Kemp má samostatný poukaz a nevstupuje do ceny koncertní vstupenky. Tmavý podklad, oranžová barva, typografie a QR navazují na web. QR nemá serverové ověření. Skutečné karetní údaje se nevyplňují a e-mail se automaticky neposílá.</w:t>
       </w:r>
     </w:p>
     <w:p>
@@ -4165,7 +4194,13 @@
     <w:p>
       <w:pPr/>
       <w:r>
-        <w:t>Registrace má jméno, příjmení, e-mail, telefon, heslo a jeho potvrzení. Profil dovoluje upravit kontakt bez změny údajů historické objednávky. Heslo se ukládá jako PBKDF2-SHA256 hash se 120 000 iteracemi a náhodnou solí; nejde o produkční autentizaci ani ověření vlastnictví e-mailu. Přihlášení vyprší za sedm dnů; toto vypršení kontroluje klientská aplikace.</w:t>
+        <w:t>Registrace má jméno, příjmení, e-mail, telefon, heslo a jeho potvrzení. Profil zobrazuje datum registrace a dovoluje upravit kontakt bez změny údajů historické objednávky. Změna hesla vyžaduje současné heslo, nové heslo a jeho potvrzení. Heslo se ukládá jako PBKDF2-SHA256 hash se 120 000 iteracemi a náhodnou solí; nejde o produkční autentizaci ani ověření vlastnictví e-mailu. Přihlášení vyprší za sedm dnů; toto vypršení kontroluje klientská aplikace.</w:t>
+      </w:r>
+    </w:p>
+    <w:p>
+      <w:pPr/>
+      <w:r>
+        <w:t>Zapomenuté heslo neobnovuje samotný e-mail. Účet má náhodný obnovovací kód, pro který se ukládá hash. Má 128 náhodných bitů, zobrazí se při vytvoření a uživatel si jej uschová. Při obnově zadá e-mail, kód a nové heslo s potvrzením. Obnova vymění také kód; starý již nelze použít. Změna i obnova ukončí dosavadní přihlášení. Starší účet si může kód vytvořit po ověření současného hesla. Bez původního hesla nebo kódu není klientské ověření možné.</w:t>
       </w:r>
     </w:p>
     <w:p>
@@ -4410,7 +4445,7 @@
               <w:rPr>
                 <w:sz w:val="16"/>
               </w:rPr>
-              <w:t>XML, XSD, XSLT, JSON Schema, OpenAPI 3.1</w:t>
+              <w:t>XML, XSD a čtyři odvozené JSON exporty</w:t>
             </w:r>
           </w:p>
         </w:tc>
@@ -4490,7 +4525,7 @@
               <w:rPr>
                 <w:sz w:val="16"/>
               </w:rPr>
-              <w:t>Python, lxml, jsonschema, PyYAML</w:t>
+              <w:t>Python a lxml</w:t>
             </w:r>
           </w:p>
         </w:tc>
@@ -4785,7 +4820,7 @@
               <w:rPr>
                 <w:sz w:val="16"/>
               </w:rPr>
-              <w:t>XML/XSD, počty, reference, transformace, schémata a shodu exportu</w:t>
+              <w:t>XML/XSD, počty, reference, časové vazby, ceny, kapacity a shodu exportů</w:t>
             </w:r>
           </w:p>
         </w:tc>
@@ -5381,7 +5416,7 @@
               <w:rPr>
                 <w:sz w:val="16"/>
               </w:rPr>
-              <w:t>Původní Značkovací jazyky</w:t>
+              <w:t>Datový základ</w:t>
             </w:r>
           </w:p>
         </w:tc>
@@ -5726,7 +5761,7 @@
               <w:rPr>
                 <w:sz w:val="16"/>
               </w:rPr>
-              <w:t>Aktuální požadavek na podklady</w:t>
+              <w:t>Zpětná vazba k cestě zákazníka</w:t>
             </w:r>
           </w:p>
         </w:tc>
@@ -5743,7 +5778,7 @@
               <w:rPr>
                 <w:sz w:val="16"/>
               </w:rPr>
-              <w:t>Zjednodušit prezentace a dokumentaci, doplnit autory a návod</w:t>
+              <w:t>Předvolit scénu a den interpreta, počítat osoby z výběru sedadel, vyžadovat oba dny, ihned obnovovat součty a zobrazovat kapacity</w:t>
             </w:r>
           </w:p>
         </w:tc>
@@ -5760,7 +5795,122 @@
               <w:rPr>
                 <w:sz w:val="16"/>
               </w:rPr>
-              <w:t>Obsah jednotlivých cvičení porovnaný se zadáním</w:t>
+              <w:t>Oprava konkrétních nejistot nákupu; průchod od interpreta až k PDF</w:t>
+            </w:r>
+          </w:p>
+        </w:tc>
+      </w:tr>
+      <w:tr>
+        <w:trPr>
+          <w:cantSplit/>
+        </w:trPr>
+        <w:tc>
+          <w:tcPr>
+            <w:tcW w:type="dxa" w:w="3175"/>
+            <w:vAlign w:val="center"/>
+            <w:shd w:fill="F5F5F5"/>
+          </w:tcPr>
+          <w:p>
+            <w:pPr>
+              <w:spacing w:after="80" w:before="80" w:line="264" w:lineRule="auto"/>
+            </w:pPr>
+            <w:r>
+              <w:rPr>
+                <w:sz w:val="16"/>
+              </w:rPr>
+              <w:t>Požadavek na přehledné podklady</w:t>
+            </w:r>
+          </w:p>
+        </w:tc>
+        <w:tc>
+          <w:tcPr>
+            <w:tcW w:type="dxa" w:w="3175"/>
+            <w:vAlign w:val="center"/>
+            <w:shd w:fill="F5F5F5"/>
+          </w:tcPr>
+          <w:p>
+            <w:pPr>
+              <w:spacing w:after="80" w:before="80" w:line="264" w:lineRule="auto"/>
+            </w:pPr>
+            <w:r>
+              <w:rPr>
+                <w:sz w:val="16"/>
+              </w:rPr>
+              <w:t>Zkrátit specifikaci a C02 prezentaci, oddělit poznámky a PDF náhled od čtyř odevzdávaných souborů</w:t>
+            </w:r>
+          </w:p>
+        </w:tc>
+        <w:tc>
+          <w:tcPr>
+            <w:tcW w:type="dxa" w:w="3175"/>
+            <w:vAlign w:val="center"/>
+            <w:shd w:fill="F5F5F5"/>
+          </w:tcPr>
+          <w:p>
+            <w:pPr>
+              <w:spacing w:after="80" w:before="80" w:line="264" w:lineRule="auto"/>
+            </w:pPr>
+            <w:r>
+              <w:rPr>
+                <w:sz w:val="16"/>
+              </w:rPr>
+              <w:t>Porovnání cílů, datových vazeb, scénářů a souborů se zadáním</w:t>
+            </w:r>
+          </w:p>
+        </w:tc>
+      </w:tr>
+      <w:tr>
+        <w:trPr>
+          <w:cantSplit/>
+        </w:trPr>
+        <w:tc>
+          <w:tcPr>
+            <w:tcW w:type="dxa" w:w="3175"/>
+            <w:vAlign w:val="center"/>
+          </w:tcPr>
+          <w:p>
+            <w:pPr>
+              <w:spacing w:after="80" w:before="80" w:line="264" w:lineRule="auto"/>
+            </w:pPr>
+            <w:r>
+              <w:rPr>
+                <w:sz w:val="16"/>
+              </w:rPr>
+              <w:t>Zjednodušení datové části</w:t>
+            </w:r>
+          </w:p>
+        </w:tc>
+        <w:tc>
+          <w:tcPr>
+            <w:tcW w:type="dxa" w:w="3175"/>
+            <w:vAlign w:val="center"/>
+          </w:tcPr>
+          <w:p>
+            <w:pPr>
+              <w:spacing w:after="80" w:before="80" w:line="264" w:lineRule="auto"/>
+            </w:pPr>
+            <w:r>
+              <w:rPr>
+                <w:sz w:val="16"/>
+              </w:rPr>
+              <w:t>Jediný XML zdroj a čtyři plné JSON exporty, odstranění historického návrhu rozhraní</w:t>
+            </w:r>
+          </w:p>
+        </w:tc>
+        <w:tc>
+          <w:tcPr>
+            <w:tcW w:type="dxa" w:w="3175"/>
+            <w:vAlign w:val="center"/>
+          </w:tcPr>
+          <w:p>
+            <w:pPr>
+              <w:spacing w:after="80" w:before="80" w:line="264" w:lineRule="auto"/>
+            </w:pPr>
+            <w:r>
+              <w:rPr>
+                <w:sz w:val="16"/>
+              </w:rPr>
+              <w:t>Reprodukovatelný export a shoda objektů s webem</w:t>
             </w:r>
           </w:p>
         </w:tc>
@@ -6393,7 +6543,7 @@
               <w:rPr>
                 <w:sz w:val="16"/>
               </w:rPr>
-              <w:t>XML/XSD, skutečné XSLT transformace a porovnání JSON/data.js</w:t>
+              <w:t>XML/XSD a přesné porovnání čtyř JSON exportů a data.js</w:t>
             </w:r>
           </w:p>
         </w:tc>
@@ -6645,7 +6795,7 @@
               <w:rPr>
                 <w:sz w:val="16"/>
               </w:rPr>
-              <w:t>„Připrav podklady podle cvičení.“</w:t>
+              <w:t>„Propoj interpreta s přesným vstupem a zobraz dostupnost.“</w:t>
             </w:r>
           </w:p>
         </w:tc>
@@ -6662,7 +6812,7 @@
               <w:rPr>
                 <w:sz w:val="16"/>
               </w:rPr>
-              <w:t>Přijato členění; odmítnut vymyšlený cizí posudek a historie týmu</w:t>
+              <w:t>Přijata předvolba z objektu vystoupení; opraven obecný odkaz a nesoulad součtů</w:t>
             </w:r>
           </w:p>
         </w:tc>
@@ -6670,6 +6820,65 @@
           <w:tcPr>
             <w:tcW w:type="dxa" w:w="3175"/>
             <w:vAlign w:val="center"/>
+          </w:tcPr>
+          <w:p>
+            <w:pPr>
+              <w:spacing w:after="80" w:before="80" w:line="264" w:lineRule="auto"/>
+            </w:pPr>
+            <w:r>
+              <w:rPr>
+                <w:sz w:val="16"/>
+              </w:rPr>
+              <w:t>Porovnání dne, scény a cen od detailu přes košík po PDF</w:t>
+            </w:r>
+          </w:p>
+        </w:tc>
+      </w:tr>
+      <w:tr>
+        <w:trPr>
+          <w:cantSplit/>
+        </w:trPr>
+        <w:tc>
+          <w:tcPr>
+            <w:tcW w:type="dxa" w:w="3175"/>
+            <w:vAlign w:val="center"/>
+            <w:shd w:fill="F5F5F5"/>
+          </w:tcPr>
+          <w:p>
+            <w:pPr>
+              <w:spacing w:after="80" w:before="80" w:line="264" w:lineRule="auto"/>
+            </w:pPr>
+            <w:r>
+              <w:rPr>
+                <w:sz w:val="16"/>
+              </w:rPr>
+              <w:t>„Připrav podklady podle cvičení.“</w:t>
+            </w:r>
+          </w:p>
+        </w:tc>
+        <w:tc>
+          <w:tcPr>
+            <w:tcW w:type="dxa" w:w="3175"/>
+            <w:vAlign w:val="center"/>
+            <w:shd w:fill="F5F5F5"/>
+          </w:tcPr>
+          <w:p>
+            <w:pPr>
+              <w:spacing w:after="80" w:before="80" w:line="264" w:lineRule="auto"/>
+            </w:pPr>
+            <w:r>
+              <w:rPr>
+                <w:sz w:val="16"/>
+              </w:rPr>
+              <w:t>Přijato členění; odmítnut vymyšlený cizí posudek a historie týmu</w:t>
+            </w:r>
+          </w:p>
+        </w:tc>
+        <w:tc>
+          <w:tcPr>
+            <w:tcW w:type="dxa" w:w="3175"/>
+            <w:vAlign w:val="center"/>
+            <w:shd w:fill="F5F5F5"/>
           </w:tcPr>
           <w:p>
             <w:pPr>

</xml_diff>